<commit_message>
Test creation of refdatapoints
</commit_message>
<xml_diff>
--- a/tests/_fixtures/refs/01_a.docx
+++ b/tests/_fixtures/refs/01_a.docx
@@ -266,7 +266,7 @@
           <w:i w:val="0"/>
           <w:iCs/>
         </w:rPr>
-        <w:t xml:space="preserve">an </w:t>
+        <w:t xml:space="preserve">a </w:t>
       </w:r>
       <w:hyperlink r:id="rId8" w:history="1">
         <w:r>
@@ -275,15 +275,7 @@
             <w:i w:val="0"/>
             <w:iCs/>
           </w:rPr>
-          <w:t xml:space="preserve">external </w:t>
-        </w:r>
-        <w:r>
-          <w:rPr>
-            <w:rStyle w:val="Hyperlink"/>
-            <w:i w:val="0"/>
-            <w:iCs/>
-          </w:rPr>
-          <w:t>link</w:t>
+          <w:t>link in caption to an external source</w:t>
         </w:r>
       </w:hyperlink>
       <w:r>
@@ -291,7 +283,7 @@
           <w:i w:val="0"/>
           <w:iCs/>
         </w:rPr>
-        <w:t xml:space="preserve"> and different </w:t>
+        <w:t xml:space="preserve"> and </w:t>
       </w:r>
       <w:hyperlink r:id="rId9" w:anchor="tblSimpleTable" w:history="1">
         <w:r>
@@ -300,15 +292,7 @@
             <w:i w:val="0"/>
             <w:iCs/>
           </w:rPr>
-          <w:t xml:space="preserve">table in </w:t>
-        </w:r>
-        <w:r>
-          <w:rPr>
-            <w:rStyle w:val="Hyperlink"/>
-            <w:i w:val="0"/>
-            <w:iCs/>
-          </w:rPr>
-          <w:t>chapter 2</w:t>
+          <w:t>link in caption to a table in chapter 2</w:t>
         </w:r>
       </w:hyperlink>
       <w:r>
@@ -1191,7 +1175,7 @@
           <w:rPr>
             <w:rStyle w:val="Hyperlink"/>
           </w:rPr>
-          <w:t>Link to an external website</w:t>
+          <w:t>Footnote link to an external website</w:t>
         </w:r>
       </w:hyperlink>
     </w:p>
@@ -1214,18 +1198,12 @@
         <w:t xml:space="preserve"> There is a </w:t>
       </w:r>
       <w:hyperlink r:id="rId2" w:history="1">
-        <w:r>
-          <w:rPr>
-            <w:rStyle w:val="Hyperlink"/>
-          </w:rPr>
-          <w:t>l</w:t>
-        </w:r>
         <w:r>
           <w:rPr>
             <w:rStyle w:val="Hyperlink"/>
             <w:lang w:val="en-US"/>
           </w:rPr>
-          <w:t>ink</w:t>
+          <w:t>footnote link</w:t>
         </w:r>
       </w:hyperlink>
       <w:r>
@@ -1258,7 +1236,7 @@
           <w:rPr>
             <w:rStyle w:val="Hyperlink"/>
           </w:rPr>
-          <w:t>end.</w:t>
+          <w:t>end of the footnote.</w:t>
         </w:r>
       </w:hyperlink>
     </w:p>

</xml_diff>